<commit_message>
Einfügen Tabelle für Dokumentation
</commit_message>
<xml_diff>
--- a/Dokumentation/Meier_Blättler_Maisenbacher_MMA25cL_Gruppe1.docx
+++ b/Dokumentation/Meier_Blättler_Maisenbacher_MMA25cL_Gruppe1.docx
@@ -50,32 +50,56 @@
                           <w:p>
                             <w:pPr>
                               <w:jc w:val="center"/>
+                              <w:rPr>
+                                <w:lang w:val="fr-CH"/>
+                              </w:rPr>
                             </w:pPr>
                             <w:r>
+                              <w:rPr>
+                                <w:lang w:val="fr-CH"/>
+                              </w:rPr>
                               <w:t>Maruice/Nico/Robin</w:t>
                             </w:r>
                           </w:p>
                           <w:p>
                             <w:pPr>
                               <w:jc w:val="center"/>
+                              <w:rPr>
+                                <w:lang w:val="fr-CH"/>
+                              </w:rPr>
                             </w:pPr>
                             <w:r>
+                              <w:rPr>
+                                <w:lang w:val="fr-CH"/>
+                              </w:rPr>
                               <w:t>MMA25cL</w:t>
                             </w:r>
                           </w:p>
                           <w:p>
                             <w:pPr>
                               <w:jc w:val="center"/>
+                              <w:rPr>
+                                <w:lang w:val="fr-CH"/>
+                              </w:rPr>
                             </w:pPr>
                             <w:r>
+                              <w:rPr>
+                                <w:lang w:val="fr-CH"/>
+                              </w:rPr>
                               <w:t>M287</w:t>
                             </w:r>
                           </w:p>
                           <w:p>
                             <w:pPr>
                               <w:jc w:val="center"/>
+                              <w:rPr>
+                                <w:lang w:val="fr-CH"/>
+                              </w:rPr>
                             </w:pPr>
                             <w:r>
+                              <w:rPr>
+                                <w:lang w:val="fr-CH"/>
+                              </w:rPr>
                               <w:t>xx.xx.2026</w:t>
                             </w:r>
                           </w:p>
@@ -111,32 +135,56 @@
                     <w:p>
                       <w:pPr>
                         <w:jc w:val="center"/>
+                        <w:rPr>
+                          <w:lang w:val="fr-CH"/>
+                        </w:rPr>
                       </w:pPr>
                       <w:r>
+                        <w:rPr>
+                          <w:lang w:val="fr-CH"/>
+                        </w:rPr>
                         <w:t>Maruice/Nico/Robin</w:t>
                       </w:r>
                     </w:p>
                     <w:p>
                       <w:pPr>
                         <w:jc w:val="center"/>
+                        <w:rPr>
+                          <w:lang w:val="fr-CH"/>
+                        </w:rPr>
                       </w:pPr>
                       <w:r>
+                        <w:rPr>
+                          <w:lang w:val="fr-CH"/>
+                        </w:rPr>
                         <w:t>MMA25cL</w:t>
                       </w:r>
                     </w:p>
                     <w:p>
                       <w:pPr>
                         <w:jc w:val="center"/>
+                        <w:rPr>
+                          <w:lang w:val="fr-CH"/>
+                        </w:rPr>
                       </w:pPr>
                       <w:r>
+                        <w:rPr>
+                          <w:lang w:val="fr-CH"/>
+                        </w:rPr>
                         <w:t>M287</w:t>
                       </w:r>
                     </w:p>
                     <w:p>
                       <w:pPr>
                         <w:jc w:val="center"/>
+                        <w:rPr>
+                          <w:lang w:val="fr-CH"/>
+                        </w:rPr>
                       </w:pPr>
                       <w:r>
+                        <w:rPr>
+                          <w:lang w:val="fr-CH"/>
+                        </w:rPr>
                         <w:t>xx.xx.2026</w:t>
                       </w:r>
                     </w:p>
@@ -234,7 +282,7 @@
         <mc:AlternateContent>
           <mc:Choice Requires="wps">
             <w:drawing>
-              <wp:anchor distT="0" distB="0" distL="114300" distR="114300" simplePos="0" relativeHeight="251669504" behindDoc="0" locked="0" layoutInCell="1" allowOverlap="1" wp14:anchorId="765BA788" wp14:editId="342940A1">
+              <wp:anchor distT="0" distB="0" distL="114300" distR="114300" simplePos="0" relativeHeight="251669504" behindDoc="0" locked="0" layoutInCell="1" allowOverlap="1" wp14:anchorId="765BA788" wp14:editId="593A4EB7">
                 <wp:simplePos x="0" y="0"/>
                 <wp:positionH relativeFrom="column">
                   <wp:posOffset>4184050</wp:posOffset>
@@ -330,7 +378,7 @@
         <mc:AlternateContent>
           <mc:Choice Requires="wps">
             <w:drawing>
-              <wp:anchor distT="0" distB="0" distL="114300" distR="114300" simplePos="0" relativeHeight="251670528" behindDoc="0" locked="0" layoutInCell="1" allowOverlap="1" wp14:anchorId="45278013" wp14:editId="341C4021">
+              <wp:anchor distT="0" distB="0" distL="114300" distR="114300" simplePos="0" relativeHeight="251670528" behindDoc="0" locked="0" layoutInCell="1" allowOverlap="1" wp14:anchorId="45278013" wp14:editId="09A24EA9">
                 <wp:simplePos x="0" y="0"/>
                 <wp:positionH relativeFrom="column">
                   <wp:posOffset>-8765540</wp:posOffset>
@@ -400,7 +448,19 @@
           </mc:Choice>
           <mc:Fallback>
             <w:pict>
-              <v:shape w14:anchorId="3102559B" id="Gleichschenkliges Dreieck 5" o:spid="_x0000_s1026" type="#_x0000_t5" style="position:absolute;margin-left:-690.2pt;margin-top:361.3pt;width:1419.15pt;height:365.85pt;rotation:90;z-index:251670528;visibility:visible;mso-wrap-style:square;mso-width-percent:0;mso-height-percent:0;mso-wrap-distance-left:9pt;mso-wrap-distance-top:0;mso-wrap-distance-right:9pt;mso-wrap-distance-bottom:0;mso-position-horizontal:absolute;mso-position-horizontal-relative:text;mso-position-vertical:absolute;mso-position-vertical-relative:text;mso-width-percent:0;mso-height-percent:0;mso-width-relative:margin;mso-height-relative:margin;v-text-anchor:middle" o:gfxdata="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" adj="10927" stroked="f" strokeweight="1.5pt"/>
+              <v:shapetype w14:anchorId="2E5E252C" id="_x0000_t5" coordsize="21600,21600" o:spt="5" adj="10800" path="m@0,l,21600r21600,xe">
+                <v:stroke joinstyle="miter"/>
+                <v:formulas>
+                  <v:f eqn="val #0"/>
+                  <v:f eqn="prod #0 1 2"/>
+                  <v:f eqn="sum @1 10800 0"/>
+                </v:formulas>
+                <v:path gradientshapeok="t" o:connecttype="custom" o:connectlocs="@0,0;@1,10800;0,21600;10800,21600;21600,21600;@2,10800" textboxrect="0,10800,10800,18000;5400,10800,16200,18000;10800,10800,21600,18000;0,7200,7200,21600;7200,7200,14400,21600;14400,7200,21600,21600"/>
+                <v:handles>
+                  <v:h position="#0,topLeft" xrange="0,21600"/>
+                </v:handles>
+              </v:shapetype>
+              <v:shape id="Gleichschenkliges Dreieck 5" o:spid="_x0000_s1026" type="#_x0000_t5" style="position:absolute;margin-left:-690.2pt;margin-top:361.3pt;width:1419.15pt;height:365.85pt;rotation:90;z-index:251670528;visibility:visible;mso-wrap-style:square;mso-width-percent:0;mso-height-percent:0;mso-wrap-distance-left:9pt;mso-wrap-distance-top:0;mso-wrap-distance-right:9pt;mso-wrap-distance-bottom:0;mso-position-horizontal:absolute;mso-position-horizontal-relative:text;mso-position-vertical:absolute;mso-position-vertical-relative:text;mso-width-percent:0;mso-height-percent:0;mso-width-relative:margin;mso-height-relative:margin;v-text-anchor:middle" o:gfxdata="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" adj="10927" stroked="f" strokeweight="1.5pt"/>
             </w:pict>
           </mc:Fallback>
         </mc:AlternateContent>
@@ -433,7 +493,7 @@
                     <pic:cNvPicPr/>
                   </pic:nvPicPr>
                   <pic:blipFill>
-                    <a:blip r:embed="rId5">
+                    <a:blip r:embed="rId7">
                       <a:extLst>
                         <a:ext uri="{28A0092B-C50C-407E-A947-70E740481C1C}">
                           <a14:useLocalDpi xmlns:a14="http://schemas.microsoft.com/office/drawing/2010/main" val="0"/>
@@ -919,13 +979,63 @@
       </w:r>
     </w:p>
     <w:sectPr>
-      <w:pgSz w:w="11906" w:h="16838"/>
+      <w:pgSz w:w="11906" w:h="16838" w:code="9"/>
       <w:pgMar w:top="1417" w:right="1417" w:bottom="1134" w:left="1417" w:header="708" w:footer="708" w:gutter="0"/>
       <w:cols w:space="708"/>
       <w:docGrid w:linePitch="360"/>
     </w:sectPr>
   </w:body>
 </w:document>
+</file>
+
+<file path=word/endnotes.xml><?xml version="1.0" encoding="utf-8"?>
+<w:endnotes xmlns:wpc="http://schemas.microsoft.com/office/word/2010/wordprocessingCanvas" xmlns:cx="http://schemas.microsoft.com/office/drawing/2014/chartex" xmlns:cx1="http://schemas.microsoft.com/office/drawing/2015/9/8/chartex" xmlns:cx2="http://schemas.microsoft.com/office/drawing/2015/10/21/chartex" xmlns:cx3="http://schemas.microsoft.com/office/drawing/2016/5/9/chartex" xmlns:cx4="http://schemas.microsoft.com/office/drawing/2016/5/10/chartex" xmlns:cx5="http://schemas.microsoft.com/office/drawing/2016/5/11/chartex" xmlns:cx6="http://schemas.microsoft.com/office/drawing/2016/5/12/chartex" xmlns:cx7="http://schemas.microsoft.com/office/drawing/2016/5/13/chartex" xmlns:cx8="http://schemas.microsoft.com/office/drawing/2016/5/14/chartex" xmlns:mc="http://schemas.openxmlformats.org/markup-compatibility/2006" xmlns:aink="http://schemas.microsoft.com/office/drawing/2016/ink" xmlns:am3d="http://schemas.microsoft.com/office/drawing/2017/model3d" xmlns:o="urn:schemas-microsoft-com:office:office" xmlns:oel="http://schemas.microsoft.com/office/2019/extlst" xmlns:r="http://schemas.openxmlformats.org/officeDocument/2006/relationships" xmlns:m="http://schemas.openxmlformats.org/officeDocument/2006/math" xmlns:v="urn:schemas-microsoft-com:vml" xmlns:wp14="http://schemas.microsoft.com/office/word/2010/wordprocessingDrawing" xmlns:wp="http://schemas.openxmlformats.org/drawingml/2006/wordprocessingDrawing" xmlns:w10="urn:schemas-microsoft-com:office:word" xmlns:w="http://schemas.openxmlformats.org/wordprocessingml/2006/main" xmlns:w14="http://schemas.microsoft.com/office/word/2010/wordml" xmlns:w15="http://schemas.microsoft.com/office/word/2012/wordml" xmlns:w16cex="http://schemas.microsoft.com/office/word/2018/wordml/cex" xmlns:w16cid="http://schemas.microsoft.com/office/word/2016/wordml/cid" xmlns:w16="http://schemas.microsoft.com/office/word/2018/wordml" xmlns:w16du="http://schemas.microsoft.com/office/word/2023/wordml/word16du" xmlns:w16sdtdh="http://schemas.microsoft.com/office/word/2020/wordml/sdtdatahash" xmlns:w16sdtfl="http://schemas.microsoft.com/office/word/2024/wordml/sdtformatlock" xmlns:w16se="http://schemas.microsoft.com/office/word/2015/wordml/symex" xmlns:wpg="http://schemas.microsoft.com/office/word/2010/wordprocessingGroup" xmlns:wpi="http://schemas.microsoft.com/office/word/2010/wordprocessingInk" xmlns:wne="http://schemas.microsoft.com/office/word/2006/wordml" xmlns:wps="http://schemas.microsoft.com/office/word/2010/wordprocessingShape" mc:Ignorable="w14 w15 w16se w16cid w16 w16cex w16sdtdh w16sdtfl w16du wp14">
+  <w:endnote w:type="separator" w:id="-1">
+    <w:p>
+      <w:pPr>
+        <w:spacing w:after="0" w:line="240" w:lineRule="auto"/>
+      </w:pPr>
+      <w:r>
+        <w:separator/>
+      </w:r>
+    </w:p>
+  </w:endnote>
+  <w:endnote w:type="continuationSeparator" w:id="0">
+    <w:p>
+      <w:pPr>
+        <w:spacing w:after="0" w:line="240" w:lineRule="auto"/>
+      </w:pPr>
+      <w:r>
+        <w:continuationSeparator/>
+      </w:r>
+    </w:p>
+  </w:endnote>
+</w:endnotes>
+</file>
+
+<file path=word/footnotes.xml><?xml version="1.0" encoding="utf-8"?>
+<w:footnotes xmlns:wpc="http://schemas.microsoft.com/office/word/2010/wordprocessingCanvas" xmlns:cx="http://schemas.microsoft.com/office/drawing/2014/chartex" xmlns:cx1="http://schemas.microsoft.com/office/drawing/2015/9/8/chartex" xmlns:cx2="http://schemas.microsoft.com/office/drawing/2015/10/21/chartex" xmlns:cx3="http://schemas.microsoft.com/office/drawing/2016/5/9/chartex" xmlns:cx4="http://schemas.microsoft.com/office/drawing/2016/5/10/chartex" xmlns:cx5="http://schemas.microsoft.com/office/drawing/2016/5/11/chartex" xmlns:cx6="http://schemas.microsoft.com/office/drawing/2016/5/12/chartex" xmlns:cx7="http://schemas.microsoft.com/office/drawing/2016/5/13/chartex" xmlns:cx8="http://schemas.microsoft.com/office/drawing/2016/5/14/chartex" xmlns:mc="http://schemas.openxmlformats.org/markup-compatibility/2006" xmlns:aink="http://schemas.microsoft.com/office/drawing/2016/ink" xmlns:am3d="http://schemas.microsoft.com/office/drawing/2017/model3d" xmlns:o="urn:schemas-microsoft-com:office:office" xmlns:oel="http://schemas.microsoft.com/office/2019/extlst" xmlns:r="http://schemas.openxmlformats.org/officeDocument/2006/relationships" xmlns:m="http://schemas.openxmlformats.org/officeDocument/2006/math" xmlns:v="urn:schemas-microsoft-com:vml" xmlns:wp14="http://schemas.microsoft.com/office/word/2010/wordprocessingDrawing" xmlns:wp="http://schemas.openxmlformats.org/drawingml/2006/wordprocessingDrawing" xmlns:w10="urn:schemas-microsoft-com:office:word" xmlns:w="http://schemas.openxmlformats.org/wordprocessingml/2006/main" xmlns:w14="http://schemas.microsoft.com/office/word/2010/wordml" xmlns:w15="http://schemas.microsoft.com/office/word/2012/wordml" xmlns:w16cex="http://schemas.microsoft.com/office/word/2018/wordml/cex" xmlns:w16cid="http://schemas.microsoft.com/office/word/2016/wordml/cid" xmlns:w16="http://schemas.microsoft.com/office/word/2018/wordml" xmlns:w16du="http://schemas.microsoft.com/office/word/2023/wordml/word16du" xmlns:w16sdtdh="http://schemas.microsoft.com/office/word/2020/wordml/sdtdatahash" xmlns:w16sdtfl="http://schemas.microsoft.com/office/word/2024/wordml/sdtformatlock" xmlns:w16se="http://schemas.microsoft.com/office/word/2015/wordml/symex" xmlns:wpg="http://schemas.microsoft.com/office/word/2010/wordprocessingGroup" xmlns:wpi="http://schemas.microsoft.com/office/word/2010/wordprocessingInk" xmlns:wne="http://schemas.microsoft.com/office/word/2006/wordml" xmlns:wps="http://schemas.microsoft.com/office/word/2010/wordprocessingShape" mc:Ignorable="w14 w15 w16se w16cid w16 w16cex w16sdtdh w16sdtfl w16du wp14">
+  <w:footnote w:type="separator" w:id="-1">
+    <w:p>
+      <w:pPr>
+        <w:spacing w:after="0" w:line="240" w:lineRule="auto"/>
+      </w:pPr>
+      <w:r>
+        <w:separator/>
+      </w:r>
+    </w:p>
+  </w:footnote>
+  <w:footnote w:type="continuationSeparator" w:id="0">
+    <w:p>
+      <w:pPr>
+        <w:spacing w:after="0" w:line="240" w:lineRule="auto"/>
+      </w:pPr>
+      <w:r>
+        <w:continuationSeparator/>
+      </w:r>
+    </w:p>
+  </w:footnote>
+</w:footnotes>
 </file>
 
 <file path=word/numbering.xml><?xml version="1.0" encoding="utf-8"?>
@@ -4071,6 +4181,7 @@
   <w:style w:type="character" w:default="1" w:styleId="Absatz-Standardschriftart">
     <w:name w:val="Default Paragraph Font"/>
     <w:uiPriority w:val="1"/>
+    <w:semiHidden/>
     <w:unhideWhenUsed/>
   </w:style>
   <w:style w:type="table" w:default="1" w:styleId="NormaleTabelle">
@@ -4383,6 +4494,50 @@
       <w:color w:val="0F4761" w:themeColor="accent1" w:themeShade="BF"/>
       <w:spacing w:val="5"/>
     </w:rPr>
+  </w:style>
+  <w:style w:type="paragraph" w:styleId="Kopfzeile">
+    <w:name w:val="header"/>
+    <w:basedOn w:val="Standard"/>
+    <w:link w:val="KopfzeileZchn"/>
+    <w:uiPriority w:val="99"/>
+    <w:unhideWhenUsed/>
+    <w:rsid w:val="00212E02"/>
+    <w:pPr>
+      <w:tabs>
+        <w:tab w:val="center" w:pos="4536"/>
+        <w:tab w:val="right" w:pos="9072"/>
+      </w:tabs>
+      <w:spacing w:after="0" w:line="240" w:lineRule="auto"/>
+    </w:pPr>
+  </w:style>
+  <w:style w:type="character" w:customStyle="1" w:styleId="KopfzeileZchn">
+    <w:name w:val="Kopfzeile Zchn"/>
+    <w:basedOn w:val="Absatz-Standardschriftart"/>
+    <w:link w:val="Kopfzeile"/>
+    <w:uiPriority w:val="99"/>
+    <w:rsid w:val="00212E02"/>
+  </w:style>
+  <w:style w:type="paragraph" w:styleId="Fuzeile">
+    <w:name w:val="footer"/>
+    <w:basedOn w:val="Standard"/>
+    <w:link w:val="FuzeileZchn"/>
+    <w:uiPriority w:val="99"/>
+    <w:unhideWhenUsed/>
+    <w:rsid w:val="00212E02"/>
+    <w:pPr>
+      <w:tabs>
+        <w:tab w:val="center" w:pos="4536"/>
+        <w:tab w:val="right" w:pos="9072"/>
+      </w:tabs>
+      <w:spacing w:after="0" w:line="240" w:lineRule="auto"/>
+    </w:pPr>
+  </w:style>
+  <w:style w:type="character" w:customStyle="1" w:styleId="FuzeileZchn">
+    <w:name w:val="Fußzeile Zchn"/>
+    <w:basedOn w:val="Absatz-Standardschriftart"/>
+    <w:link w:val="Fuzeile"/>
+    <w:uiPriority w:val="99"/>
+    <w:rsid w:val="00212E02"/>
   </w:style>
 </w:styles>
 </file>

</xml_diff>